<commit_message>
Add pyflate Section 9 hardware acceleration proposal
Huffman Fast-Decode Unit (HFDU): a two-level LUT-based canonical Huffman
decoder in SystemVerilog, replacing find_next_symbols O(n) linear scan
with a fixed-latency table lookup. Covers hardware description,
inputs/outputs, architecture, HW/SW interface (block-header parsing and
MTF/BWT/RLE stay in software; only the per-symbol decode moves to
hardware), acceleration justification, block diagram, and
performance/area/power trade-offs. Six table banks held simultaneously to
avoid stalling on the every-50-symbol selector table switches.

nbody marked Not applicable -- the hardware effort targets pyflate only.

Co-Authored-By: Claude Sonnet 5 <noreply@anthropic.com>
</commit_message>
<xml_diff>
--- a/pyflate/report_pyflate.docx
+++ b/pyflate/report_pyflate.docx
@@ -1359,7 +1359,364 @@
           <w:i w:val="0"/>
           <w:sz w:val="22"/>
         </w:rPr>
-        <w:t>(To be completed -- Section 9: hardware description, inputs/outputs, architecture, hardware/software interface, acceleration justification, block diagram, and performance/area/power trade-offs.)</w:t>
+        <w:t>Targets the per-symbol Huffman decode loop (HuffmanTable.find_next_symbol(), lines 224-233) -- the single largest algorithmic bottleneck from the initial analysis: an O(n) linear scan of the symbol table, run once per decoded symbol.</w:t>
+      </w:r>
+    </w:p>
+    <w:p>
+      <w:pPr>
+        <w:pStyle w:val="Heading3"/>
+      </w:pPr>
+      <w:r>
+        <w:rPr>
+          <w:rFonts w:ascii="Calibri" w:hAnsi="Calibri"/>
+          <w:i w:val="0"/>
+        </w:rPr>
+        <w:t>Hardware description</w:t>
+      </w:r>
+    </w:p>
+    <w:p>
+      <w:r>
+        <w:rPr>
+          <w:rFonts w:ascii="Calibri" w:hAnsi="Calibri"/>
+          <w:b w:val="0"/>
+          <w:i w:val="0"/>
+          <w:sz w:val="22"/>
+        </w:rPr>
+        <w:t>A Canonical Huffman Fast-Decode Unit (HFDU), implemented in SystemVerilog: a two-level lookup-table decoder that replaces the linear scan with a fixed-latency table lookup. Six independent table banks are held in hardware simultaneously, one per bzip2 Huffman group (a block can use up to 6 groups, switched every 50 symbols via the selector mechanism), so table switches never stall the pipeline.</w:t>
+      </w:r>
+    </w:p>
+    <w:p>
+      <w:pPr>
+        <w:pStyle w:val="Heading3"/>
+      </w:pPr>
+      <w:r>
+        <w:rPr>
+          <w:rFonts w:ascii="Calibri" w:hAnsi="Calibri"/>
+          <w:i w:val="0"/>
+        </w:rPr>
+        <w:t>Inputs and outputs</w:t>
+      </w:r>
+    </w:p>
+    <w:p>
+      <w:r>
+        <w:rPr>
+          <w:rFonts w:ascii="Calibri" w:hAnsi="Calibri"/>
+          <w:b w:val="0"/>
+          <w:i w:val="0"/>
+          <w:sz w:val="22"/>
+        </w:rPr>
+        <w:t>Table load port: per table bank (0-5), a stream of precomputed Level-1 (256-entry) and Level-2 lookup entries, loaded once per block.</w:t>
+      </w:r>
+    </w:p>
+    <w:p>
+      <w:r>
+        <w:rPr>
+          <w:rFonts w:ascii="Calibri" w:hAnsi="Calibri"/>
+          <w:b w:val="0"/>
+          <w:i w:val="0"/>
+          <w:sz w:val="22"/>
+        </w:rPr>
+        <w:t>Selector stream: a small FIFO of 3-bit table-bank indices, one per 50-symbol run, consumed as decoding proceeds.</w:t>
+      </w:r>
+    </w:p>
+    <w:p>
+      <w:r>
+        <w:rPr>
+          <w:rFonts w:ascii="Calibri" w:hAnsi="Calibri"/>
+          <w:b w:val="0"/>
+          <w:i w:val="0"/>
+          <w:sz w:val="22"/>
+        </w:rPr>
+        <w:t>Bitstream input: the block's compressed bit sequence, streamed in as it is consumed -- no full-block buffering required.</w:t>
+      </w:r>
+    </w:p>
+    <w:p>
+      <w:r>
+        <w:rPr>
+          <w:rFonts w:ascii="Calibri" w:hAnsi="Calibri"/>
+          <w:b w:val="0"/>
+          <w:i w:val="0"/>
+          <w:sz w:val="22"/>
+        </w:rPr>
+        <w:t>Symbol output: a stream of symbol (9 bits) and code length (5 bits) pairs, one per decoded Huffman symbol.</w:t>
+      </w:r>
+    </w:p>
+    <w:p>
+      <w:r>
+        <w:rPr>
+          <w:rFonts w:ascii="Calibri" w:hAnsi="Calibri"/>
+          <w:b w:val="0"/>
+          <w:i w:val="0"/>
+          <w:sz w:val="22"/>
+        </w:rPr>
+        <w:t>Control and status: start, done, error (malformed or unfound code), symbols-decoded counter.</w:t>
+      </w:r>
+    </w:p>
+    <w:p>
+      <w:r>
+        <w:rPr>
+          <w:rFonts w:ascii="Calibri" w:hAnsi="Calibri"/>
+          <w:b w:val="0"/>
+          <w:i w:val="0"/>
+          <w:sz w:val="22"/>
+        </w:rPr>
+        <w:t>Target frequency: 200-400 MHz for an FPGA prototype; a full-custom ASIC implementation of the same logic would clock significantly higher.</w:t>
+      </w:r>
+    </w:p>
+    <w:p>
+      <w:pPr>
+        <w:pStyle w:val="Heading3"/>
+      </w:pPr>
+      <w:r>
+        <w:rPr>
+          <w:rFonts w:ascii="Calibri" w:hAnsi="Calibri"/>
+          <w:i w:val="0"/>
+        </w:rPr>
+        <w:t>Hardware architecture</w:t>
+      </w:r>
+    </w:p>
+    <w:p>
+      <w:r>
+        <w:rPr>
+          <w:rFonts w:ascii="Calibri" w:hAnsi="Calibri"/>
+          <w:b w:val="0"/>
+          <w:i w:val="0"/>
+          <w:sz w:val="22"/>
+        </w:rPr>
+        <w:t>Bit-window shift register: holds the next 20 unconsumed bits, refilled from the bitstream input FIFO as bits are consumed -- mirrors the existing Bitfield/RBitfield refill logic in software, just in hardware.</w:t>
+      </w:r>
+    </w:p>
+    <w:p>
+      <w:r>
+        <w:rPr>
+          <w:rFonts w:ascii="Calibri" w:hAnsi="Calibri"/>
+          <w:b w:val="0"/>
+          <w:i w:val="0"/>
+          <w:sz w:val="22"/>
+        </w:rPr>
+        <w:t>Level-1 table (256-entry SRAM per bank): indexed by the top 8 bits of the bit window. A hit returns symbol and length directly in one cycle. Since most Huffman codes in real data are short, this resolves the large majority of symbols.</w:t>
+      </w:r>
+    </w:p>
+    <w:p>
+      <w:r>
+        <w:rPr>
+          <w:rFonts w:ascii="Calibri" w:hAnsi="Calibri"/>
+          <w:b w:val="0"/>
+          <w:i w:val="0"/>
+          <w:sz w:val="22"/>
+        </w:rPr>
+        <w:t>Level-2 table (smaller SRAM per bank): reached only when the Level-1 entry is an escape -- a code longer than 8 bits sharing that 8-bit prefix. Adds a small number of cycles only for the minority of long codes.</w:t>
+      </w:r>
+    </w:p>
+    <w:p>
+      <w:r>
+        <w:rPr>
+          <w:rFonts w:ascii="Calibri" w:hAnsi="Calibri"/>
+          <w:b w:val="0"/>
+          <w:i w:val="0"/>
+          <w:sz w:val="22"/>
+        </w:rPr>
+        <w:t>Decode control FSM: drives the per-cycle lookup, shifts the bit window by the returned code length, and refills from the input FIFO.</w:t>
+      </w:r>
+    </w:p>
+    <w:p>
+      <w:r>
+        <w:rPr>
+          <w:rFonts w:ascii="Calibri" w:hAnsi="Calibri"/>
+          <w:b w:val="0"/>
+          <w:i w:val="0"/>
+          <w:sz w:val="22"/>
+        </w:rPr>
+        <w:t>Selector or table-switch counter: a down-counter that starts at 50 and decrements per decoded symbol; at zero, it reads the next entry from the selector FIFO and switches the active table-bank index for the next run.</w:t>
+      </w:r>
+    </w:p>
+    <w:p>
+      <w:pPr>
+        <w:pStyle w:val="Heading3"/>
+      </w:pPr>
+      <w:r>
+        <w:rPr>
+          <w:rFonts w:ascii="Calibri" w:hAnsi="Calibri"/>
+          <w:i w:val="0"/>
+        </w:rPr>
+        <w:t>Hardware/software interface</w:t>
+      </w:r>
+    </w:p>
+    <w:p>
+      <w:r>
+        <w:rPr>
+          <w:rFonts w:ascii="Calibri" w:hAnsi="Calibri"/>
+          <w:b w:val="0"/>
+          <w:i w:val="0"/>
+          <w:sz w:val="22"/>
+        </w:rPr>
+        <w:t>Block-header parsing stays in software, unchanged (compute_used, compute_selectors_list, compute_tables -- a one-time, cheap step per block, not the hot path). What changes: instead of building the Python HuffmanTable object structure that find_next_symbol scans, software builds the Level-1/Level-2 LUT contents for each active group (itself a small, one-time-per-block computation) and DMAs them into the accelerator's table banks. Software also DMAs the block's selector list and remaining bitstream in, then streams the decoded symbols back out via a second DMA channel, before continuing with move_to_front, BWT reverse, and RLE decode exactly as today in Python -- those stay software-side, since the initial analysis found their cost is CPython allocator overhead, not algorithmic complexity, and they do not benefit from this kind of fixed-function hardware the same way.</w:t>
+      </w:r>
+    </w:p>
+    <w:p>
+      <w:r>
+        <w:rPr>
+          <w:rFonts w:ascii="Calibri" w:hAnsi="Calibri"/>
+          <w:b w:val="0"/>
+          <w:i w:val="0"/>
+          <w:sz w:val="22"/>
+        </w:rPr>
+        <w:t>Control and status (start/done/error, table-bank valid bits) are exposed as a small memory-mapped register file, AXI-Lite style. Bulk data (tables, bitstream, symbols) moves over AXI-Stream-style DMA channels, since those are the throughput-critical paths.</w:t>
+      </w:r>
+    </w:p>
+    <w:p>
+      <w:pPr>
+        <w:pStyle w:val="Heading3"/>
+      </w:pPr>
+      <w:r>
+        <w:rPr>
+          <w:rFonts w:ascii="Calibri" w:hAnsi="Calibri"/>
+          <w:i w:val="0"/>
+        </w:rPr>
+        <w:t>Acceleration justification</w:t>
+      </w:r>
+    </w:p>
+    <w:p>
+      <w:r>
+        <w:rPr>
+          <w:rFonts w:ascii="Calibri" w:hAnsi="Calibri"/>
+          <w:b w:val="0"/>
+          <w:i w:val="0"/>
+          <w:sz w:val="22"/>
+        </w:rPr>
+        <w:t>find_next_symbol's linear scan is the single largest algorithmic inefficiency identified in profiling: symbol-lookup cost scales with table size times symbols decoded, not just symbols decoded, and every symbol in the entire decompressed output pays this cost. A fixed-latency table lookup replaces an O(n) scan with O(1) in the common case, or a small constant number of cycles in the escape case, independent of table size.</w:t>
+      </w:r>
+    </w:p>
+    <w:p>
+      <w:r>
+        <w:rPr>
+          <w:rFonts w:ascii="Calibri" w:hAnsi="Calibri"/>
+          <w:b w:val="0"/>
+          <w:i w:val="0"/>
+          <w:sz w:val="22"/>
+        </w:rPr>
+        <w:t>This mirrors real-world precedent: hardware DEFLATE and bzip2 decompression accelerators -- NIC offload engines, storage controllers, Intel QAT -- use exactly this two-level LUT technique for the same reason. It is a genuine hardware advantage, not just C beating Python: even the software fix (swapping in C-accelerated bz2) works by doing a similar table-driven decode instead of a linear scan, which hardware can do with even lower latency and no instruction-dispatch overhead at all.</w:t>
+      </w:r>
+    </w:p>
+    <w:p>
+      <w:pPr>
+        <w:pStyle w:val="Heading3"/>
+      </w:pPr>
+      <w:r>
+        <w:rPr>
+          <w:rFonts w:ascii="Calibri" w:hAnsi="Calibri"/>
+          <w:i w:val="0"/>
+        </w:rPr>
+        <w:t>Performance, area, and power trade-offs</w:t>
+      </w:r>
+    </w:p>
+    <w:p>
+      <w:r>
+        <w:rPr>
+          <w:rFonts w:ascii="Calibri" w:hAnsi="Calibri"/>
+          <w:b w:val="0"/>
+          <w:i w:val="0"/>
+          <w:sz w:val="22"/>
+        </w:rPr>
+        <w:t>Performance: the software profile attributes roughly 6-7% of total self-time directly to the scan's call and lookup overhead (call_function, lookdict_unicode_nodummy, PyTuple_GetItem, binary_op1 combined), and this excludes the scan's own O(n) comparison cost, which scales with table size and dominates for larger tables. Removing it collapses the decode step to roughly one cycle per symbol in hardware, removing this bottleneck as a limiter entirely. The software-side move_to_front, BWT reverse, and RLE steps then become the new critical path unless separately accelerated.</w:t>
+      </w:r>
+    </w:p>
+    <w:p>
+      <w:r>
+        <w:rPr>
+          <w:rFonts w:ascii="Calibri" w:hAnsi="Calibri"/>
+          <w:b w:val="0"/>
+          <w:i w:val="0"/>
+          <w:sz w:val="22"/>
+        </w:rPr>
+        <w:t>Area: modest. Six banks of a 256-entry Level-1 SRAM plus a small Level-2 SRAM each is a handful of KB of total table storage -- inexpensive in both FPGA BRAM and ASIC SRAM terms.</w:t>
+      </w:r>
+    </w:p>
+    <w:p>
+      <w:r>
+        <w:rPr>
+          <w:rFonts w:ascii="Calibri" w:hAnsi="Calibri"/>
+          <w:b w:val="0"/>
+          <w:i w:val="0"/>
+          <w:sz w:val="22"/>
+        </w:rPr>
+        <w:t>Power: dominated by SRAM read energy and shift-register toggling at the decode rate, substantially lower than the equivalent work executed through a general-purpose CPU's fetch/decode/dispatch pipeline, since there is no instruction overhead at all, just a table read and a compare per symbol.</w:t>
+      </w:r>
+    </w:p>
+    <w:p>
+      <w:r>
+        <w:rPr>
+          <w:rFonts w:ascii="Calibri" w:hAnsi="Calibri"/>
+          <w:b w:val="0"/>
+          <w:i w:val="0"/>
+          <w:sz w:val="22"/>
+        </w:rPr>
+        <w:t>Trade-off made explicitly: holding all 6 table banks simultaneously, rather than one reloadable bank, trades a modest amount of extra SRAM area for zero table-switch stalls, since switches happen every 50 symbols and a reload-based design would otherwise pay a refill penalty on every switch.</w:t>
+      </w:r>
+    </w:p>
+    <w:p>
+      <w:pPr>
+        <w:pStyle w:val="Heading3"/>
+      </w:pPr>
+      <w:r>
+        <w:rPr>
+          <w:rFonts w:ascii="Calibri" w:hAnsi="Calibri"/>
+          <w:i w:val="0"/>
+        </w:rPr>
+        <w:t>Block diagram</w:t>
+      </w:r>
+    </w:p>
+    <w:p>
+      <w:pPr>
+        <w:jc w:val="center"/>
+      </w:pPr>
+      <w:r>
+        <w:drawing>
+          <wp:inline xmlns:a="http://schemas.openxmlformats.org/drawingml/2006/main" xmlns:pic="http://schemas.openxmlformats.org/drawingml/2006/picture">
+            <wp:extent cx="5943600" cy="3782291"/>
+            <wp:docPr id="3" name="Picture 3"/>
+            <wp:cNvGraphicFramePr>
+              <a:graphicFrameLocks noChangeAspect="1"/>
+            </wp:cNvGraphicFramePr>
+            <a:graphic>
+              <a:graphicData uri="http://schemas.openxmlformats.org/drawingml/2006/picture">
+                <pic:pic>
+                  <pic:nvPicPr>
+                    <pic:cNvPr id="0" name="hfdu_block_diagram.png"/>
+                    <pic:cNvPicPr/>
+                  </pic:nvPicPr>
+                  <pic:blipFill>
+                    <a:blip r:embed="rId11"/>
+                    <a:stretch>
+                      <a:fillRect/>
+                    </a:stretch>
+                  </pic:blipFill>
+                  <pic:spPr>
+                    <a:xfrm>
+                      <a:off x="0" y="0"/>
+                      <a:ext cx="5943600" cy="3782291"/>
+                    </a:xfrm>
+                    <a:prstGeom prst="rect"/>
+                  </pic:spPr>
+                </pic:pic>
+              </a:graphicData>
+            </a:graphic>
+          </wp:inline>
+        </w:drawing>
+      </w:r>
+    </w:p>
+    <w:p>
+      <w:pPr>
+        <w:jc w:val="center"/>
+      </w:pPr>
+      <w:r>
+        <w:rPr>
+          <w:rFonts w:ascii="Calibri" w:hAnsi="Calibri"/>
+          <w:b w:val="0"/>
+          <w:i w:val="0"/>
+          <w:sz w:val="20"/>
+        </w:rPr>
+        <w:t>Software (left) parses the block header and builds the Level-1/Level-2 table contents, then DMAs the table banks, selector list, and bitstream into the HFDU (right). Inside the HFDU, the bit-window register feeds the Level-1/Level-2 tables selected by the active-bank register; the decode FSM emits symbol and length pairs and shifts the window. Decoded symbols stream back to software, which continues with move_to_front, BWT reverse, and RLE decode as before. A small AXI-Lite control/status register file (start, done, error) sits alongside the DMA channels.</w:t>
       </w:r>
     </w:p>
     <w:p>

</xml_diff>